<commit_message>
Added support for large PCAP processing
</commit_message>
<xml_diff>
--- a/Task4_ProgressReport.docx
+++ b/Task4_ProgressReport.docx
@@ -4,15 +4,58 @@
   <w:body>
     <w:p>
       <w:pPr>
-        <w:rPr>
-          <w:lang w:val="en-US"/>
-        </w:rPr>
-      </w:pPr>
-      <w:r>
-        <w:rPr>
-          <w:lang w:val="en-US"/>
-        </w:rPr>
-        <w:t xml:space="preserve">Task 4 – Incremental build of </w:t>
+        <w:jc w:val="center"/>
+        <w:rPr>
+          <w:b/>
+          <w:u w:val="single"/>
+          <w:lang w:val="en-US"/>
+        </w:rPr>
+      </w:pPr>
+      <w:r>
+        <w:rPr>
+          <w:b/>
+          <w:u w:val="single"/>
+          <w:lang w:val="en-US"/>
+        </w:rPr>
+        <w:t xml:space="preserve">Task 4 – </w:t>
+      </w:r>
+      <w:proofErr w:type="spellStart"/>
+      <w:r>
+        <w:rPr>
+          <w:b/>
+          <w:u w:val="single"/>
+          <w:lang w:val="en-US"/>
+        </w:rPr>
+        <w:t>Streamlit</w:t>
+      </w:r>
+      <w:proofErr w:type="spellEnd"/>
+      <w:r>
+        <w:rPr>
+          <w:b/>
+          <w:u w:val="single"/>
+          <w:lang w:val="en-US"/>
+        </w:rPr>
+        <w:t xml:space="preserve"> Dashboard to visualize network traffic</w:t>
+      </w:r>
+    </w:p>
+    <w:p>
+      <w:pPr>
+        <w:rPr>
+          <w:lang w:val="en-US"/>
+        </w:rPr>
+      </w:pPr>
+    </w:p>
+    <w:p>
+      <w:pPr>
+        <w:rPr>
+          <w:lang w:val="en-US"/>
+        </w:rPr>
+      </w:pPr>
+      <w:r>
+        <w:rPr>
+          <w:lang w:val="en-US"/>
+        </w:rPr>
+        <w:t xml:space="preserve">Incremental build of </w:t>
       </w:r>
       <w:proofErr w:type="spellStart"/>
       <w:r>
@@ -186,6 +229,7 @@
           <w:noProof/>
           <w:lang w:eastAsia="en-IN"/>
         </w:rPr>
+        <w:lastRenderedPageBreak/>
         <w:drawing>
           <wp:inline distT="0" distB="0" distL="0" distR="0" wp14:anchorId="7B115F25" wp14:editId="6749CE90">
             <wp:extent cx="5731510" cy="3456940"/>
@@ -225,6 +269,56 @@
     </w:p>
     <w:p>
       <w:pPr>
+        <w:rPr>
+          <w:lang w:val="en-US"/>
+        </w:rPr>
+      </w:pPr>
+    </w:p>
+    <w:p>
+      <w:pPr>
+        <w:rPr>
+          <w:b/>
+          <w:u w:val="single"/>
+          <w:lang w:val="en-US"/>
+        </w:rPr>
+      </w:pPr>
+    </w:p>
+    <w:p>
+      <w:pPr>
+        <w:rPr>
+          <w:b/>
+          <w:u w:val="single"/>
+          <w:lang w:val="en-US"/>
+        </w:rPr>
+      </w:pPr>
+      <w:r>
+        <w:rPr>
+          <w:b/>
+          <w:u w:val="single"/>
+          <w:lang w:val="en-US"/>
+        </w:rPr>
+        <w:t>Final Outputs of the dashboard</w:t>
+      </w:r>
+    </w:p>
+    <w:p>
+      <w:pPr>
+        <w:rPr>
+          <w:b/>
+          <w:u w:val="single"/>
+          <w:lang w:val="en-US"/>
+        </w:rPr>
+      </w:pPr>
+      <w:r>
+        <w:rPr>
+          <w:b/>
+          <w:u w:val="single"/>
+          <w:lang w:val="en-US"/>
+        </w:rPr>
+        <w:t>Captured traffic:</w:t>
+      </w:r>
+    </w:p>
+    <w:p>
+      <w:pPr>
         <w:pStyle w:val="ListParagraph"/>
         <w:numPr>
           <w:ilvl w:val="0"/>
@@ -238,56 +332,66 @@
         <w:rPr>
           <w:lang w:val="en-US"/>
         </w:rPr>
+        <w:t>Analysis performed and displayed on Captured Traffic (</w:t>
+      </w:r>
+      <w:r>
+        <w:rPr>
+          <w:lang w:val="en-US"/>
+        </w:rPr>
+        <w:t xml:space="preserve">larger 5min </w:t>
+      </w:r>
+      <w:proofErr w:type="spellStart"/>
+      <w:r>
+        <w:rPr>
+          <w:lang w:val="en-US"/>
+        </w:rPr>
+        <w:t>nw</w:t>
+      </w:r>
+      <w:proofErr w:type="spellEnd"/>
+      <w:r>
+        <w:rPr>
+          <w:lang w:val="en-US"/>
+        </w:rPr>
+        <w:t xml:space="preserve"> traffic </w:t>
+      </w:r>
+      <w:proofErr w:type="spellStart"/>
+      <w:r>
+        <w:rPr>
+          <w:lang w:val="en-US"/>
+        </w:rPr>
+        <w:t>pcap</w:t>
+      </w:r>
+      <w:proofErr w:type="spellEnd"/>
+      <w:r>
+        <w:rPr>
+          <w:lang w:val="en-US"/>
+        </w:rPr>
+        <w:t xml:space="preserve"> file of 1.3 GB</w:t>
+      </w:r>
+      <w:r>
+        <w:rPr>
+          <w:lang w:val="en-US"/>
+        </w:rPr>
+        <w:t>)</w:t>
+      </w:r>
+    </w:p>
+    <w:p>
+      <w:pPr>
+        <w:pStyle w:val="ListParagraph"/>
+        <w:rPr>
+          <w:lang w:val="en-US"/>
+        </w:rPr>
+      </w:pPr>
+      <w:r>
+        <w:rPr>
+          <w:lang w:val="en-US"/>
+        </w:rPr>
         <w:lastRenderedPageBreak/>
-        <w:t xml:space="preserve">Analysis performed and displayed on Captured Traffic (smaller </w:t>
-      </w:r>
-      <w:proofErr w:type="gramStart"/>
-      <w:r>
-        <w:rPr>
-          <w:lang w:val="en-US"/>
-        </w:rPr>
-        <w:t>demo .</w:t>
-      </w:r>
-      <w:proofErr w:type="spellStart"/>
-      <w:r>
-        <w:rPr>
-          <w:lang w:val="en-US"/>
-        </w:rPr>
-        <w:t>pcap</w:t>
-      </w:r>
-      <w:proofErr w:type="spellEnd"/>
-      <w:proofErr w:type="gramEnd"/>
-      <w:r>
-        <w:rPr>
-          <w:lang w:val="en-US"/>
-        </w:rPr>
-        <w:t xml:space="preserve"> file)</w:t>
-      </w:r>
-      <w:bookmarkStart w:id="0" w:name="_GoBack"/>
-      <w:bookmarkEnd w:id="0"/>
-    </w:p>
-    <w:p>
-      <w:pPr>
-        <w:rPr>
-          <w:lang w:val="en-US"/>
-        </w:rPr>
-      </w:pPr>
-    </w:p>
-    <w:p>
-      <w:pPr>
-        <w:rPr>
-          <w:lang w:val="en-US"/>
-        </w:rPr>
-      </w:pPr>
-      <w:r>
-        <w:rPr>
-          <w:lang w:val="en-US"/>
-        </w:rPr>
         <w:drawing>
-          <wp:inline distT="0" distB="0" distL="0" distR="0" wp14:anchorId="7D216C29" wp14:editId="7F58E8E0">
-            <wp:extent cx="5731510" cy="3223895"/>
-            <wp:effectExtent l="0" t="0" r="2540" b="0"/>
-            <wp:docPr id="5" name="Picture 5"/>
+          <wp:inline distT="0" distB="0" distL="0" distR="0" wp14:anchorId="49CBF3E2" wp14:editId="1CB3E939">
+            <wp:extent cx="5731510" cy="6209030"/>
+            <wp:effectExtent l="0" t="0" r="2540" b="1270"/>
+            <wp:docPr id="17" name="Picture 17"/>
             <wp:cNvGraphicFramePr>
               <a:graphicFrameLocks xmlns:a="http://schemas.openxmlformats.org/drawingml/2006/main" noChangeAspect="1"/>
             </wp:cNvGraphicFramePr>
@@ -307,7 +411,7 @@
                   <pic:spPr>
                     <a:xfrm>
                       <a:off x="0" y="0"/>
-                      <a:ext cx="5731510" cy="3223895"/>
+                      <a:ext cx="5731510" cy="6209030"/>
                     </a:xfrm>
                     <a:prstGeom prst="rect">
                       <a:avLst/>
@@ -322,19 +426,29 @@
     </w:p>
     <w:p>
       <w:pPr>
-        <w:rPr>
-          <w:lang w:val="en-US"/>
-        </w:rPr>
-      </w:pPr>
-      <w:r>
-        <w:rPr>
-          <w:lang w:val="en-US"/>
-        </w:rPr>
+        <w:pStyle w:val="ListParagraph"/>
+        <w:rPr>
+          <w:lang w:val="en-US"/>
+        </w:rPr>
+      </w:pPr>
+    </w:p>
+    <w:p>
+      <w:pPr>
+        <w:pStyle w:val="ListParagraph"/>
+        <w:rPr>
+          <w:lang w:val="en-US"/>
+        </w:rPr>
+      </w:pPr>
+      <w:r>
+        <w:rPr>
+          <w:lang w:val="en-US"/>
+        </w:rPr>
+        <w:lastRenderedPageBreak/>
         <w:drawing>
-          <wp:inline distT="0" distB="0" distL="0" distR="0" wp14:anchorId="4102B764" wp14:editId="280EB0BE">
-            <wp:extent cx="5731510" cy="3223895"/>
-            <wp:effectExtent l="0" t="0" r="2540" b="0"/>
-            <wp:docPr id="4" name="Picture 4"/>
+          <wp:inline distT="0" distB="0" distL="0" distR="0" wp14:anchorId="0BF6362D" wp14:editId="13C435EE">
+            <wp:extent cx="5731510" cy="6209030"/>
+            <wp:effectExtent l="0" t="0" r="2540" b="1270"/>
+            <wp:docPr id="18" name="Picture 18"/>
             <wp:cNvGraphicFramePr>
               <a:graphicFrameLocks xmlns:a="http://schemas.openxmlformats.org/drawingml/2006/main" noChangeAspect="1"/>
             </wp:cNvGraphicFramePr>
@@ -354,7 +468,7 @@
                   <pic:spPr>
                     <a:xfrm>
                       <a:off x="0" y="0"/>
-                      <a:ext cx="5731510" cy="3223895"/>
+                      <a:ext cx="5731510" cy="6209030"/>
                     </a:xfrm>
                     <a:prstGeom prst="rect">
                       <a:avLst/>
@@ -369,6 +483,15 @@
     </w:p>
     <w:p>
       <w:pPr>
+        <w:pStyle w:val="ListParagraph"/>
+        <w:rPr>
+          <w:lang w:val="en-US"/>
+        </w:rPr>
+      </w:pPr>
+    </w:p>
+    <w:p>
+      <w:pPr>
+        <w:pStyle w:val="ListParagraph"/>
         <w:rPr>
           <w:lang w:val="en-US"/>
         </w:rPr>
@@ -379,10 +502,10 @@
         </w:rPr>
         <w:lastRenderedPageBreak/>
         <w:drawing>
-          <wp:inline distT="0" distB="0" distL="0" distR="0" wp14:anchorId="07CF5CC5" wp14:editId="0684F96D">
-            <wp:extent cx="5731510" cy="3223895"/>
-            <wp:effectExtent l="0" t="0" r="2540" b="0"/>
-            <wp:docPr id="3" name="Picture 3"/>
+          <wp:inline distT="0" distB="0" distL="0" distR="0" wp14:anchorId="0DD6958E" wp14:editId="4D22C6EB">
+            <wp:extent cx="5731510" cy="3445510"/>
+            <wp:effectExtent l="0" t="0" r="2540" b="2540"/>
+            <wp:docPr id="19" name="Picture 19"/>
             <wp:cNvGraphicFramePr>
               <a:graphicFrameLocks xmlns:a="http://schemas.openxmlformats.org/drawingml/2006/main" noChangeAspect="1"/>
             </wp:cNvGraphicFramePr>
@@ -402,7 +525,7 @@
                   <pic:spPr>
                     <a:xfrm>
                       <a:off x="0" y="0"/>
-                      <a:ext cx="5731510" cy="3223895"/>
+                      <a:ext cx="5731510" cy="3445510"/>
                     </a:xfrm>
                     <a:prstGeom prst="rect">
                       <a:avLst/>
@@ -417,13 +540,15 @@
     </w:p>
     <w:p>
       <w:pPr>
-        <w:rPr>
-          <w:lang w:val="en-US"/>
-        </w:rPr>
-      </w:pPr>
-    </w:p>
-    <w:p>
-      <w:pPr>
+        <w:pStyle w:val="ListParagraph"/>
+        <w:rPr>
+          <w:lang w:val="en-US"/>
+        </w:rPr>
+      </w:pPr>
+    </w:p>
+    <w:p>
+      <w:pPr>
+        <w:pStyle w:val="ListParagraph"/>
         <w:rPr>
           <w:lang w:val="en-US"/>
         </w:rPr>
@@ -433,10 +558,10 @@
           <w:lang w:val="en-US"/>
         </w:rPr>
         <w:drawing>
-          <wp:inline distT="0" distB="0" distL="0" distR="0" wp14:anchorId="10DE4967" wp14:editId="38FA3B50">
-            <wp:extent cx="5731510" cy="3223895"/>
-            <wp:effectExtent l="0" t="0" r="2540" b="0"/>
-            <wp:docPr id="6" name="Picture 6"/>
+          <wp:inline distT="0" distB="0" distL="0" distR="0" wp14:anchorId="16AE7097" wp14:editId="7E3D6DF5">
+            <wp:extent cx="5731510" cy="3445510"/>
+            <wp:effectExtent l="0" t="0" r="2540" b="2540"/>
+            <wp:docPr id="20" name="Picture 20"/>
             <wp:cNvGraphicFramePr>
               <a:graphicFrameLocks xmlns:a="http://schemas.openxmlformats.org/drawingml/2006/main" noChangeAspect="1"/>
             </wp:cNvGraphicFramePr>
@@ -456,7 +581,7 @@
                   <pic:spPr>
                     <a:xfrm>
                       <a:off x="0" y="0"/>
-                      <a:ext cx="5731510" cy="3223895"/>
+                      <a:ext cx="5731510" cy="3445510"/>
                     </a:xfrm>
                     <a:prstGeom prst="rect">
                       <a:avLst/>
@@ -471,13 +596,23 @@
     </w:p>
     <w:p>
       <w:pPr>
-        <w:rPr>
-          <w:lang w:val="en-US"/>
-        </w:rPr>
-      </w:pPr>
-    </w:p>
-    <w:p>
-      <w:pPr>
+        <w:pStyle w:val="ListParagraph"/>
+        <w:rPr>
+          <w:lang w:val="en-US"/>
+        </w:rPr>
+      </w:pPr>
+    </w:p>
+    <w:p>
+      <w:pPr>
+        <w:pStyle w:val="ListParagraph"/>
+        <w:rPr>
+          <w:lang w:val="en-US"/>
+        </w:rPr>
+      </w:pPr>
+    </w:p>
+    <w:p>
+      <w:pPr>
+        <w:pStyle w:val="ListParagraph"/>
         <w:rPr>
           <w:lang w:val="en-US"/>
         </w:rPr>
@@ -488,10 +623,10 @@
         </w:rPr>
         <w:lastRenderedPageBreak/>
         <w:drawing>
-          <wp:inline distT="0" distB="0" distL="0" distR="0" wp14:anchorId="53719749" wp14:editId="6208786C">
-            <wp:extent cx="5731510" cy="5237480"/>
-            <wp:effectExtent l="0" t="0" r="2540" b="1270"/>
-            <wp:docPr id="7" name="Picture 7"/>
+          <wp:inline distT="0" distB="0" distL="0" distR="0" wp14:anchorId="2C779CD3" wp14:editId="0AF7EFC3">
+            <wp:extent cx="5731510" cy="3445510"/>
+            <wp:effectExtent l="0" t="0" r="2540" b="2540"/>
+            <wp:docPr id="21" name="Picture 21"/>
             <wp:cNvGraphicFramePr>
               <a:graphicFrameLocks xmlns:a="http://schemas.openxmlformats.org/drawingml/2006/main" noChangeAspect="1"/>
             </wp:cNvGraphicFramePr>
@@ -511,7 +646,7 @@
                   <pic:spPr>
                     <a:xfrm>
                       <a:off x="0" y="0"/>
-                      <a:ext cx="5731510" cy="5237480"/>
+                      <a:ext cx="5731510" cy="3445510"/>
                     </a:xfrm>
                     <a:prstGeom prst="rect">
                       <a:avLst/>
@@ -526,27 +661,28 @@
     </w:p>
     <w:p>
       <w:pPr>
-        <w:rPr>
-          <w:lang w:val="en-US"/>
-        </w:rPr>
-      </w:pPr>
-    </w:p>
-    <w:p>
-      <w:pPr>
-        <w:rPr>
-          <w:lang w:val="en-US"/>
-        </w:rPr>
-      </w:pPr>
-      <w:r>
-        <w:rPr>
-          <w:lang w:val="en-US"/>
-        </w:rPr>
-        <w:lastRenderedPageBreak/>
+        <w:pStyle w:val="ListParagraph"/>
+        <w:rPr>
+          <w:lang w:val="en-US"/>
+        </w:rPr>
+      </w:pPr>
+    </w:p>
+    <w:p>
+      <w:pPr>
+        <w:pStyle w:val="ListParagraph"/>
+        <w:rPr>
+          <w:lang w:val="en-US"/>
+        </w:rPr>
+      </w:pPr>
+      <w:r>
+        <w:rPr>
+          <w:lang w:val="en-US"/>
+        </w:rPr>
         <w:drawing>
-          <wp:inline distT="0" distB="0" distL="0" distR="0" wp14:anchorId="13CAE330" wp14:editId="729B7AD1">
-            <wp:extent cx="5731510" cy="5237480"/>
-            <wp:effectExtent l="0" t="0" r="2540" b="1270"/>
-            <wp:docPr id="8" name="Picture 8"/>
+          <wp:inline distT="0" distB="0" distL="0" distR="0" wp14:anchorId="78982BE2" wp14:editId="586D0051">
+            <wp:extent cx="5731510" cy="3445510"/>
+            <wp:effectExtent l="0" t="0" r="2540" b="2540"/>
+            <wp:docPr id="22" name="Picture 22"/>
             <wp:cNvGraphicFramePr>
               <a:graphicFrameLocks xmlns:a="http://schemas.openxmlformats.org/drawingml/2006/main" noChangeAspect="1"/>
             </wp:cNvGraphicFramePr>
@@ -566,7 +702,7 @@
                   <pic:spPr>
                     <a:xfrm>
                       <a:off x="0" y="0"/>
-                      <a:ext cx="5731510" cy="5237480"/>
+                      <a:ext cx="5731510" cy="3445510"/>
                     </a:xfrm>
                     <a:prstGeom prst="rect">
                       <a:avLst/>
@@ -581,13 +717,15 @@
     </w:p>
     <w:p>
       <w:pPr>
-        <w:rPr>
-          <w:lang w:val="en-US"/>
-        </w:rPr>
-      </w:pPr>
-    </w:p>
-    <w:p>
-      <w:pPr>
+        <w:pStyle w:val="ListParagraph"/>
+        <w:rPr>
+          <w:lang w:val="en-US"/>
+        </w:rPr>
+      </w:pPr>
+    </w:p>
+    <w:p>
+      <w:pPr>
+        <w:pStyle w:val="ListParagraph"/>
         <w:rPr>
           <w:lang w:val="en-US"/>
         </w:rPr>
@@ -598,10 +736,10 @@
         </w:rPr>
         <w:lastRenderedPageBreak/>
         <w:drawing>
-          <wp:inline distT="0" distB="0" distL="0" distR="0" wp14:anchorId="67B7801B" wp14:editId="549AD209">
-            <wp:extent cx="5731510" cy="5237480"/>
-            <wp:effectExtent l="0" t="0" r="2540" b="1270"/>
-            <wp:docPr id="9" name="Picture 9"/>
+          <wp:inline distT="0" distB="0" distL="0" distR="0" wp14:anchorId="460A09DC" wp14:editId="13D5F544">
+            <wp:extent cx="5731510" cy="3445510"/>
+            <wp:effectExtent l="0" t="0" r="2540" b="2540"/>
+            <wp:docPr id="23" name="Picture 23"/>
             <wp:cNvGraphicFramePr>
               <a:graphicFrameLocks xmlns:a="http://schemas.openxmlformats.org/drawingml/2006/main" noChangeAspect="1"/>
             </wp:cNvGraphicFramePr>
@@ -621,7 +759,7 @@
                   <pic:spPr>
                     <a:xfrm>
                       <a:off x="0" y="0"/>
-                      <a:ext cx="5731510" cy="5237480"/>
+                      <a:ext cx="5731510" cy="3445510"/>
                     </a:xfrm>
                     <a:prstGeom prst="rect">
                       <a:avLst/>
@@ -636,40 +774,28 @@
     </w:p>
     <w:p>
       <w:pPr>
-        <w:rPr>
-          <w:lang w:val="en-US"/>
-        </w:rPr>
-      </w:pPr>
-    </w:p>
-    <w:p>
-      <w:pPr>
-        <w:rPr>
-          <w:lang w:val="en-US"/>
-        </w:rPr>
-      </w:pPr>
-      <w:r>
-        <w:rPr>
-          <w:lang w:val="en-US"/>
-        </w:rPr>
-        <w:t>2) LIVE CAPTURE</w:t>
-      </w:r>
-    </w:p>
-    <w:p>
-      <w:pPr>
-        <w:rPr>
-          <w:lang w:val="en-US"/>
-        </w:rPr>
-      </w:pPr>
-      <w:r>
-        <w:rPr>
-          <w:lang w:val="en-US"/>
-        </w:rPr>
-        <w:lastRenderedPageBreak/>
+        <w:pStyle w:val="ListParagraph"/>
+        <w:rPr>
+          <w:lang w:val="en-US"/>
+        </w:rPr>
+      </w:pPr>
+    </w:p>
+    <w:p>
+      <w:pPr>
+        <w:pStyle w:val="ListParagraph"/>
+        <w:rPr>
+          <w:lang w:val="en-US"/>
+        </w:rPr>
+      </w:pPr>
+      <w:r>
+        <w:rPr>
+          <w:lang w:val="en-US"/>
+        </w:rPr>
         <w:drawing>
-          <wp:inline distT="0" distB="0" distL="0" distR="0" wp14:anchorId="672B9AF4" wp14:editId="706E6065">
-            <wp:extent cx="5731510" cy="5237480"/>
-            <wp:effectExtent l="0" t="0" r="2540" b="1270"/>
-            <wp:docPr id="10" name="Picture 10"/>
+          <wp:inline distT="0" distB="0" distL="0" distR="0" wp14:anchorId="0FF3BA17" wp14:editId="296D64F0">
+            <wp:extent cx="5731510" cy="3445510"/>
+            <wp:effectExtent l="0" t="0" r="2540" b="2540"/>
+            <wp:docPr id="24" name="Picture 24"/>
             <wp:cNvGraphicFramePr>
               <a:graphicFrameLocks xmlns:a="http://schemas.openxmlformats.org/drawingml/2006/main" noChangeAspect="1"/>
             </wp:cNvGraphicFramePr>
@@ -689,7 +815,7 @@
                   <pic:spPr>
                     <a:xfrm>
                       <a:off x="0" y="0"/>
-                      <a:ext cx="5731510" cy="5237480"/>
+                      <a:ext cx="5731510" cy="3445510"/>
                     </a:xfrm>
                     <a:prstGeom prst="rect">
                       <a:avLst/>
@@ -704,13 +830,15 @@
     </w:p>
     <w:p>
       <w:pPr>
-        <w:rPr>
-          <w:lang w:val="en-US"/>
-        </w:rPr>
-      </w:pPr>
-    </w:p>
-    <w:p>
-      <w:pPr>
+        <w:pStyle w:val="ListParagraph"/>
+        <w:rPr>
+          <w:lang w:val="en-US"/>
+        </w:rPr>
+      </w:pPr>
+    </w:p>
+    <w:p>
+      <w:pPr>
+        <w:pStyle w:val="ListParagraph"/>
         <w:rPr>
           <w:lang w:val="en-US"/>
         </w:rPr>
@@ -721,10 +849,10 @@
         </w:rPr>
         <w:lastRenderedPageBreak/>
         <w:drawing>
-          <wp:inline distT="0" distB="0" distL="0" distR="0" wp14:anchorId="299B81D2" wp14:editId="5AB46FF6">
-            <wp:extent cx="5731510" cy="5237480"/>
-            <wp:effectExtent l="0" t="0" r="2540" b="1270"/>
-            <wp:docPr id="11" name="Picture 11"/>
+          <wp:inline distT="0" distB="0" distL="0" distR="0" wp14:anchorId="5F79B290" wp14:editId="65C710E5">
+            <wp:extent cx="5731510" cy="3445510"/>
+            <wp:effectExtent l="0" t="0" r="2540" b="2540"/>
+            <wp:docPr id="25" name="Picture 25"/>
             <wp:cNvGraphicFramePr>
               <a:graphicFrameLocks xmlns:a="http://schemas.openxmlformats.org/drawingml/2006/main" noChangeAspect="1"/>
             </wp:cNvGraphicFramePr>
@@ -744,7 +872,7 @@
                   <pic:spPr>
                     <a:xfrm>
                       <a:off x="0" y="0"/>
-                      <a:ext cx="5731510" cy="5237480"/>
+                      <a:ext cx="5731510" cy="3445510"/>
                     </a:xfrm>
                     <a:prstGeom prst="rect">
                       <a:avLst/>
@@ -759,27 +887,93 @@
     </w:p>
     <w:p>
       <w:pPr>
-        <w:rPr>
-          <w:lang w:val="en-US"/>
-        </w:rPr>
-      </w:pPr>
-    </w:p>
-    <w:p>
-      <w:pPr>
-        <w:rPr>
-          <w:lang w:val="en-US"/>
-        </w:rPr>
-      </w:pPr>
-      <w:r>
-        <w:rPr>
-          <w:lang w:val="en-US"/>
-        </w:rPr>
-        <w:lastRenderedPageBreak/>
+        <w:pStyle w:val="ListParagraph"/>
+        <w:rPr>
+          <w:lang w:val="en-US"/>
+        </w:rPr>
+      </w:pPr>
+    </w:p>
+    <w:p>
+      <w:pPr>
+        <w:pStyle w:val="ListParagraph"/>
+        <w:rPr>
+          <w:lang w:val="en-US"/>
+        </w:rPr>
+      </w:pPr>
+      <w:bookmarkStart w:id="0" w:name="_GoBack"/>
+      <w:bookmarkEnd w:id="0"/>
+    </w:p>
+    <w:p>
+      <w:pPr>
+        <w:pStyle w:val="ListParagraph"/>
+        <w:rPr>
+          <w:lang w:val="en-US"/>
+        </w:rPr>
+      </w:pPr>
+    </w:p>
+    <w:p>
+      <w:pPr>
+        <w:pStyle w:val="ListParagraph"/>
+        <w:numPr>
+          <w:ilvl w:val="0"/>
+          <w:numId w:val="1"/>
+        </w:numPr>
+        <w:rPr>
+          <w:lang w:val="en-US"/>
+        </w:rPr>
+      </w:pPr>
+      <w:r>
+        <w:rPr>
+          <w:lang w:val="en-US"/>
+        </w:rPr>
+        <w:t xml:space="preserve">Analysis performed and displayed on Captured Traffic (smaller </w:t>
+      </w:r>
+      <w:proofErr w:type="gramStart"/>
+      <w:r>
+        <w:rPr>
+          <w:lang w:val="en-US"/>
+        </w:rPr>
+        <w:t>demo .</w:t>
+      </w:r>
+      <w:proofErr w:type="spellStart"/>
+      <w:r>
+        <w:rPr>
+          <w:lang w:val="en-US"/>
+        </w:rPr>
+        <w:t>pcap</w:t>
+      </w:r>
+      <w:proofErr w:type="spellEnd"/>
+      <w:proofErr w:type="gramEnd"/>
+      <w:r>
+        <w:rPr>
+          <w:lang w:val="en-US"/>
+        </w:rPr>
+        <w:t xml:space="preserve"> file)</w:t>
+      </w:r>
+    </w:p>
+    <w:p>
+      <w:pPr>
+        <w:rPr>
+          <w:lang w:val="en-US"/>
+        </w:rPr>
+      </w:pPr>
+    </w:p>
+    <w:p>
+      <w:pPr>
+        <w:rPr>
+          <w:lang w:val="en-US"/>
+        </w:rPr>
+      </w:pPr>
+      <w:r>
+        <w:rPr>
+          <w:noProof/>
+          <w:lang w:eastAsia="en-IN"/>
+        </w:rPr>
         <w:drawing>
-          <wp:inline distT="0" distB="0" distL="0" distR="0" wp14:anchorId="6D8F199C" wp14:editId="4BD0EC60">
-            <wp:extent cx="5731510" cy="5237480"/>
-            <wp:effectExtent l="0" t="0" r="2540" b="1270"/>
-            <wp:docPr id="12" name="Picture 12"/>
+          <wp:inline distT="0" distB="0" distL="0" distR="0" wp14:anchorId="7D216C29" wp14:editId="7F58E8E0">
+            <wp:extent cx="5731510" cy="3223895"/>
+            <wp:effectExtent l="0" t="0" r="2540" b="0"/>
+            <wp:docPr id="5" name="Picture 5"/>
             <wp:cNvGraphicFramePr>
               <a:graphicFrameLocks xmlns:a="http://schemas.openxmlformats.org/drawingml/2006/main" noChangeAspect="1"/>
             </wp:cNvGraphicFramePr>
@@ -799,7 +993,7 @@
                   <pic:spPr>
                     <a:xfrm>
                       <a:off x="0" y="0"/>
-                      <a:ext cx="5731510" cy="5237480"/>
+                      <a:ext cx="5731510" cy="3223895"/>
                     </a:xfrm>
                     <a:prstGeom prst="rect">
                       <a:avLst/>
@@ -818,23 +1012,17 @@
           <w:lang w:val="en-US"/>
         </w:rPr>
       </w:pPr>
-    </w:p>
-    <w:p>
-      <w:pPr>
-        <w:rPr>
-          <w:lang w:val="en-US"/>
-        </w:rPr>
-      </w:pPr>
-      <w:r>
-        <w:rPr>
-          <w:lang w:val="en-US"/>
+      <w:r>
+        <w:rPr>
+          <w:noProof/>
+          <w:lang w:eastAsia="en-IN"/>
         </w:rPr>
         <w:lastRenderedPageBreak/>
         <w:drawing>
-          <wp:inline distT="0" distB="0" distL="0" distR="0" wp14:anchorId="0C071B66" wp14:editId="3C1CABBB">
-            <wp:extent cx="5731510" cy="5081905"/>
-            <wp:effectExtent l="0" t="0" r="2540" b="4445"/>
-            <wp:docPr id="13" name="Picture 13"/>
+          <wp:inline distT="0" distB="0" distL="0" distR="0" wp14:anchorId="4102B764" wp14:editId="280EB0BE">
+            <wp:extent cx="5731510" cy="3223895"/>
+            <wp:effectExtent l="0" t="0" r="2540" b="0"/>
+            <wp:docPr id="4" name="Picture 4"/>
             <wp:cNvGraphicFramePr>
               <a:graphicFrameLocks xmlns:a="http://schemas.openxmlformats.org/drawingml/2006/main" noChangeAspect="1"/>
             </wp:cNvGraphicFramePr>
@@ -854,7 +1042,7 @@
                   <pic:spPr>
                     <a:xfrm>
                       <a:off x="0" y="0"/>
-                      <a:ext cx="5731510" cy="5081905"/>
+                      <a:ext cx="5731510" cy="3223895"/>
                     </a:xfrm>
                     <a:prstGeom prst="rect">
                       <a:avLst/>
@@ -873,23 +1061,16 @@
           <w:lang w:val="en-US"/>
         </w:rPr>
       </w:pPr>
-    </w:p>
-    <w:p>
-      <w:pPr>
-        <w:rPr>
-          <w:lang w:val="en-US"/>
-        </w:rPr>
-      </w:pPr>
-      <w:r>
-        <w:rPr>
-          <w:lang w:val="en-US"/>
-        </w:rPr>
-        <w:lastRenderedPageBreak/>
+      <w:r>
+        <w:rPr>
+          <w:noProof/>
+          <w:lang w:eastAsia="en-IN"/>
+        </w:rPr>
         <w:drawing>
-          <wp:inline distT="0" distB="0" distL="0" distR="0" wp14:anchorId="2C3E30C5" wp14:editId="2992EA91">
-            <wp:extent cx="5731510" cy="5081905"/>
-            <wp:effectExtent l="0" t="0" r="2540" b="4445"/>
-            <wp:docPr id="14" name="Picture 14"/>
+          <wp:inline distT="0" distB="0" distL="0" distR="0" wp14:anchorId="07CF5CC5" wp14:editId="0684F96D">
+            <wp:extent cx="5731510" cy="3223895"/>
+            <wp:effectExtent l="0" t="0" r="2540" b="0"/>
+            <wp:docPr id="3" name="Picture 3"/>
             <wp:cNvGraphicFramePr>
               <a:graphicFrameLocks xmlns:a="http://schemas.openxmlformats.org/drawingml/2006/main" noChangeAspect="1"/>
             </wp:cNvGraphicFramePr>
@@ -909,7 +1090,7 @@
                   <pic:spPr>
                     <a:xfrm>
                       <a:off x="0" y="0"/>
-                      <a:ext cx="5731510" cy="5081905"/>
+                      <a:ext cx="5731510" cy="3223895"/>
                     </a:xfrm>
                     <a:prstGeom prst="rect">
                       <a:avLst/>
@@ -937,14 +1118,15 @@
       </w:pPr>
       <w:r>
         <w:rPr>
-          <w:lang w:val="en-US"/>
+          <w:noProof/>
+          <w:lang w:eastAsia="en-IN"/>
         </w:rPr>
         <w:lastRenderedPageBreak/>
         <w:drawing>
-          <wp:inline distT="0" distB="0" distL="0" distR="0" wp14:anchorId="296FD76D" wp14:editId="415E2127">
-            <wp:extent cx="5731510" cy="5081905"/>
-            <wp:effectExtent l="0" t="0" r="2540" b="4445"/>
-            <wp:docPr id="15" name="Picture 15"/>
+          <wp:inline distT="0" distB="0" distL="0" distR="0" wp14:anchorId="10DE4967" wp14:editId="38FA3B50">
+            <wp:extent cx="5731510" cy="3223895"/>
+            <wp:effectExtent l="0" t="0" r="2540" b="0"/>
+            <wp:docPr id="6" name="Picture 6"/>
             <wp:cNvGraphicFramePr>
               <a:graphicFrameLocks xmlns:a="http://schemas.openxmlformats.org/drawingml/2006/main" noChangeAspect="1"/>
             </wp:cNvGraphicFramePr>
@@ -964,6 +1146,430 @@
                   <pic:spPr>
                     <a:xfrm>
                       <a:off x="0" y="0"/>
+                      <a:ext cx="5731510" cy="3223895"/>
+                    </a:xfrm>
+                    <a:prstGeom prst="rect">
+                      <a:avLst/>
+                    </a:prstGeom>
+                  </pic:spPr>
+                </pic:pic>
+              </a:graphicData>
+            </a:graphic>
+          </wp:inline>
+        </w:drawing>
+      </w:r>
+    </w:p>
+    <w:p>
+      <w:pPr>
+        <w:rPr>
+          <w:lang w:val="en-US"/>
+        </w:rPr>
+      </w:pPr>
+    </w:p>
+    <w:p>
+      <w:pPr>
+        <w:rPr>
+          <w:lang w:val="en-US"/>
+        </w:rPr>
+      </w:pPr>
+      <w:r>
+        <w:rPr>
+          <w:noProof/>
+          <w:lang w:eastAsia="en-IN"/>
+        </w:rPr>
+        <w:lastRenderedPageBreak/>
+        <w:drawing>
+          <wp:inline distT="0" distB="0" distL="0" distR="0" wp14:anchorId="53719749" wp14:editId="6208786C">
+            <wp:extent cx="5731510" cy="5237480"/>
+            <wp:effectExtent l="0" t="0" r="2540" b="1270"/>
+            <wp:docPr id="7" name="Picture 7"/>
+            <wp:cNvGraphicFramePr>
+              <a:graphicFrameLocks xmlns:a="http://schemas.openxmlformats.org/drawingml/2006/main" noChangeAspect="1"/>
+            </wp:cNvGraphicFramePr>
+            <a:graphic xmlns:a="http://schemas.openxmlformats.org/drawingml/2006/main">
+              <a:graphicData uri="http://schemas.openxmlformats.org/drawingml/2006/picture">
+                <pic:pic xmlns:pic="http://schemas.openxmlformats.org/drawingml/2006/picture">
+                  <pic:nvPicPr>
+                    <pic:cNvPr id="1" name=""/>
+                    <pic:cNvPicPr/>
+                  </pic:nvPicPr>
+                  <pic:blipFill>
+                    <a:blip r:embed="rId20"/>
+                    <a:stretch>
+                      <a:fillRect/>
+                    </a:stretch>
+                  </pic:blipFill>
+                  <pic:spPr>
+                    <a:xfrm>
+                      <a:off x="0" y="0"/>
+                      <a:ext cx="5731510" cy="5237480"/>
+                    </a:xfrm>
+                    <a:prstGeom prst="rect">
+                      <a:avLst/>
+                    </a:prstGeom>
+                  </pic:spPr>
+                </pic:pic>
+              </a:graphicData>
+            </a:graphic>
+          </wp:inline>
+        </w:drawing>
+      </w:r>
+    </w:p>
+    <w:p>
+      <w:pPr>
+        <w:rPr>
+          <w:lang w:val="en-US"/>
+        </w:rPr>
+      </w:pPr>
+    </w:p>
+    <w:p>
+      <w:pPr>
+        <w:rPr>
+          <w:lang w:val="en-US"/>
+        </w:rPr>
+      </w:pPr>
+      <w:r>
+        <w:rPr>
+          <w:noProof/>
+          <w:lang w:eastAsia="en-IN"/>
+        </w:rPr>
+        <w:lastRenderedPageBreak/>
+        <w:drawing>
+          <wp:inline distT="0" distB="0" distL="0" distR="0" wp14:anchorId="13CAE330" wp14:editId="729B7AD1">
+            <wp:extent cx="5731510" cy="5237480"/>
+            <wp:effectExtent l="0" t="0" r="2540" b="1270"/>
+            <wp:docPr id="8" name="Picture 8"/>
+            <wp:cNvGraphicFramePr>
+              <a:graphicFrameLocks xmlns:a="http://schemas.openxmlformats.org/drawingml/2006/main" noChangeAspect="1"/>
+            </wp:cNvGraphicFramePr>
+            <a:graphic xmlns:a="http://schemas.openxmlformats.org/drawingml/2006/main">
+              <a:graphicData uri="http://schemas.openxmlformats.org/drawingml/2006/picture">
+                <pic:pic xmlns:pic="http://schemas.openxmlformats.org/drawingml/2006/picture">
+                  <pic:nvPicPr>
+                    <pic:cNvPr id="1" name=""/>
+                    <pic:cNvPicPr/>
+                  </pic:nvPicPr>
+                  <pic:blipFill>
+                    <a:blip r:embed="rId21"/>
+                    <a:stretch>
+                      <a:fillRect/>
+                    </a:stretch>
+                  </pic:blipFill>
+                  <pic:spPr>
+                    <a:xfrm>
+                      <a:off x="0" y="0"/>
+                      <a:ext cx="5731510" cy="5237480"/>
+                    </a:xfrm>
+                    <a:prstGeom prst="rect">
+                      <a:avLst/>
+                    </a:prstGeom>
+                  </pic:spPr>
+                </pic:pic>
+              </a:graphicData>
+            </a:graphic>
+          </wp:inline>
+        </w:drawing>
+      </w:r>
+    </w:p>
+    <w:p>
+      <w:pPr>
+        <w:rPr>
+          <w:lang w:val="en-US"/>
+        </w:rPr>
+      </w:pPr>
+    </w:p>
+    <w:p>
+      <w:pPr>
+        <w:rPr>
+          <w:lang w:val="en-US"/>
+        </w:rPr>
+      </w:pPr>
+      <w:r>
+        <w:rPr>
+          <w:noProof/>
+          <w:lang w:eastAsia="en-IN"/>
+        </w:rPr>
+        <w:lastRenderedPageBreak/>
+        <w:drawing>
+          <wp:inline distT="0" distB="0" distL="0" distR="0" wp14:anchorId="67B7801B" wp14:editId="549AD209">
+            <wp:extent cx="5731510" cy="5237480"/>
+            <wp:effectExtent l="0" t="0" r="2540" b="1270"/>
+            <wp:docPr id="9" name="Picture 9"/>
+            <wp:cNvGraphicFramePr>
+              <a:graphicFrameLocks xmlns:a="http://schemas.openxmlformats.org/drawingml/2006/main" noChangeAspect="1"/>
+            </wp:cNvGraphicFramePr>
+            <a:graphic xmlns:a="http://schemas.openxmlformats.org/drawingml/2006/main">
+              <a:graphicData uri="http://schemas.openxmlformats.org/drawingml/2006/picture">
+                <pic:pic xmlns:pic="http://schemas.openxmlformats.org/drawingml/2006/picture">
+                  <pic:nvPicPr>
+                    <pic:cNvPr id="1" name=""/>
+                    <pic:cNvPicPr/>
+                  </pic:nvPicPr>
+                  <pic:blipFill>
+                    <a:blip r:embed="rId22"/>
+                    <a:stretch>
+                      <a:fillRect/>
+                    </a:stretch>
+                  </pic:blipFill>
+                  <pic:spPr>
+                    <a:xfrm>
+                      <a:off x="0" y="0"/>
+                      <a:ext cx="5731510" cy="5237480"/>
+                    </a:xfrm>
+                    <a:prstGeom prst="rect">
+                      <a:avLst/>
+                    </a:prstGeom>
+                  </pic:spPr>
+                </pic:pic>
+              </a:graphicData>
+            </a:graphic>
+          </wp:inline>
+        </w:drawing>
+      </w:r>
+    </w:p>
+    <w:p>
+      <w:pPr>
+        <w:rPr>
+          <w:lang w:val="en-US"/>
+        </w:rPr>
+      </w:pPr>
+    </w:p>
+    <w:p>
+      <w:pPr>
+        <w:rPr>
+          <w:lang w:val="en-US"/>
+        </w:rPr>
+      </w:pPr>
+    </w:p>
+    <w:p>
+      <w:pPr>
+        <w:rPr>
+          <w:b/>
+          <w:u w:val="single"/>
+          <w:lang w:val="en-US"/>
+        </w:rPr>
+      </w:pPr>
+      <w:r>
+        <w:rPr>
+          <w:b/>
+          <w:u w:val="single"/>
+          <w:lang w:val="en-US"/>
+        </w:rPr>
+        <w:t>LIVE CAPTURE</w:t>
+      </w:r>
+      <w:r>
+        <w:rPr>
+          <w:b/>
+          <w:u w:val="single"/>
+          <w:lang w:val="en-US"/>
+        </w:rPr>
+        <w:t>:</w:t>
+      </w:r>
+    </w:p>
+    <w:p>
+      <w:pPr>
+        <w:rPr>
+          <w:lang w:val="en-US"/>
+        </w:rPr>
+      </w:pPr>
+      <w:r>
+        <w:rPr>
+          <w:noProof/>
+          <w:lang w:eastAsia="en-IN"/>
+        </w:rPr>
+        <w:lastRenderedPageBreak/>
+        <w:drawing>
+          <wp:inline distT="0" distB="0" distL="0" distR="0" wp14:anchorId="672B9AF4" wp14:editId="706E6065">
+            <wp:extent cx="5731510" cy="5237480"/>
+            <wp:effectExtent l="0" t="0" r="2540" b="1270"/>
+            <wp:docPr id="10" name="Picture 10"/>
+            <wp:cNvGraphicFramePr>
+              <a:graphicFrameLocks xmlns:a="http://schemas.openxmlformats.org/drawingml/2006/main" noChangeAspect="1"/>
+            </wp:cNvGraphicFramePr>
+            <a:graphic xmlns:a="http://schemas.openxmlformats.org/drawingml/2006/main">
+              <a:graphicData uri="http://schemas.openxmlformats.org/drawingml/2006/picture">
+                <pic:pic xmlns:pic="http://schemas.openxmlformats.org/drawingml/2006/picture">
+                  <pic:nvPicPr>
+                    <pic:cNvPr id="1" name=""/>
+                    <pic:cNvPicPr/>
+                  </pic:nvPicPr>
+                  <pic:blipFill>
+                    <a:blip r:embed="rId23"/>
+                    <a:stretch>
+                      <a:fillRect/>
+                    </a:stretch>
+                  </pic:blipFill>
+                  <pic:spPr>
+                    <a:xfrm>
+                      <a:off x="0" y="0"/>
+                      <a:ext cx="5731510" cy="5237480"/>
+                    </a:xfrm>
+                    <a:prstGeom prst="rect">
+                      <a:avLst/>
+                    </a:prstGeom>
+                  </pic:spPr>
+                </pic:pic>
+              </a:graphicData>
+            </a:graphic>
+          </wp:inline>
+        </w:drawing>
+      </w:r>
+    </w:p>
+    <w:p>
+      <w:pPr>
+        <w:rPr>
+          <w:lang w:val="en-US"/>
+        </w:rPr>
+      </w:pPr>
+    </w:p>
+    <w:p>
+      <w:pPr>
+        <w:rPr>
+          <w:lang w:val="en-US"/>
+        </w:rPr>
+      </w:pPr>
+      <w:r>
+        <w:rPr>
+          <w:noProof/>
+          <w:lang w:eastAsia="en-IN"/>
+        </w:rPr>
+        <w:lastRenderedPageBreak/>
+        <w:drawing>
+          <wp:inline distT="0" distB="0" distL="0" distR="0" wp14:anchorId="299B81D2" wp14:editId="5AB46FF6">
+            <wp:extent cx="5731510" cy="5237480"/>
+            <wp:effectExtent l="0" t="0" r="2540" b="1270"/>
+            <wp:docPr id="11" name="Picture 11"/>
+            <wp:cNvGraphicFramePr>
+              <a:graphicFrameLocks xmlns:a="http://schemas.openxmlformats.org/drawingml/2006/main" noChangeAspect="1"/>
+            </wp:cNvGraphicFramePr>
+            <a:graphic xmlns:a="http://schemas.openxmlformats.org/drawingml/2006/main">
+              <a:graphicData uri="http://schemas.openxmlformats.org/drawingml/2006/picture">
+                <pic:pic xmlns:pic="http://schemas.openxmlformats.org/drawingml/2006/picture">
+                  <pic:nvPicPr>
+                    <pic:cNvPr id="1" name=""/>
+                    <pic:cNvPicPr/>
+                  </pic:nvPicPr>
+                  <pic:blipFill>
+                    <a:blip r:embed="rId24"/>
+                    <a:stretch>
+                      <a:fillRect/>
+                    </a:stretch>
+                  </pic:blipFill>
+                  <pic:spPr>
+                    <a:xfrm>
+                      <a:off x="0" y="0"/>
+                      <a:ext cx="5731510" cy="5237480"/>
+                    </a:xfrm>
+                    <a:prstGeom prst="rect">
+                      <a:avLst/>
+                    </a:prstGeom>
+                  </pic:spPr>
+                </pic:pic>
+              </a:graphicData>
+            </a:graphic>
+          </wp:inline>
+        </w:drawing>
+      </w:r>
+    </w:p>
+    <w:p>
+      <w:pPr>
+        <w:rPr>
+          <w:lang w:val="en-US"/>
+        </w:rPr>
+      </w:pPr>
+    </w:p>
+    <w:p>
+      <w:pPr>
+        <w:rPr>
+          <w:lang w:val="en-US"/>
+        </w:rPr>
+      </w:pPr>
+      <w:r>
+        <w:rPr>
+          <w:noProof/>
+          <w:lang w:eastAsia="en-IN"/>
+        </w:rPr>
+        <w:lastRenderedPageBreak/>
+        <w:drawing>
+          <wp:inline distT="0" distB="0" distL="0" distR="0" wp14:anchorId="6D8F199C" wp14:editId="4BD0EC60">
+            <wp:extent cx="5731510" cy="5237480"/>
+            <wp:effectExtent l="0" t="0" r="2540" b="1270"/>
+            <wp:docPr id="12" name="Picture 12"/>
+            <wp:cNvGraphicFramePr>
+              <a:graphicFrameLocks xmlns:a="http://schemas.openxmlformats.org/drawingml/2006/main" noChangeAspect="1"/>
+            </wp:cNvGraphicFramePr>
+            <a:graphic xmlns:a="http://schemas.openxmlformats.org/drawingml/2006/main">
+              <a:graphicData uri="http://schemas.openxmlformats.org/drawingml/2006/picture">
+                <pic:pic xmlns:pic="http://schemas.openxmlformats.org/drawingml/2006/picture">
+                  <pic:nvPicPr>
+                    <pic:cNvPr id="1" name=""/>
+                    <pic:cNvPicPr/>
+                  </pic:nvPicPr>
+                  <pic:blipFill>
+                    <a:blip r:embed="rId25"/>
+                    <a:stretch>
+                      <a:fillRect/>
+                    </a:stretch>
+                  </pic:blipFill>
+                  <pic:spPr>
+                    <a:xfrm>
+                      <a:off x="0" y="0"/>
+                      <a:ext cx="5731510" cy="5237480"/>
+                    </a:xfrm>
+                    <a:prstGeom prst="rect">
+                      <a:avLst/>
+                    </a:prstGeom>
+                  </pic:spPr>
+                </pic:pic>
+              </a:graphicData>
+            </a:graphic>
+          </wp:inline>
+        </w:drawing>
+      </w:r>
+    </w:p>
+    <w:p>
+      <w:pPr>
+        <w:rPr>
+          <w:lang w:val="en-US"/>
+        </w:rPr>
+      </w:pPr>
+    </w:p>
+    <w:p>
+      <w:pPr>
+        <w:rPr>
+          <w:lang w:val="en-US"/>
+        </w:rPr>
+      </w:pPr>
+      <w:r>
+        <w:rPr>
+          <w:noProof/>
+          <w:lang w:eastAsia="en-IN"/>
+        </w:rPr>
+        <w:lastRenderedPageBreak/>
+        <w:drawing>
+          <wp:inline distT="0" distB="0" distL="0" distR="0" wp14:anchorId="0C071B66" wp14:editId="3C1CABBB">
+            <wp:extent cx="5731510" cy="5081905"/>
+            <wp:effectExtent l="0" t="0" r="2540" b="4445"/>
+            <wp:docPr id="13" name="Picture 13"/>
+            <wp:cNvGraphicFramePr>
+              <a:graphicFrameLocks xmlns:a="http://schemas.openxmlformats.org/drawingml/2006/main" noChangeAspect="1"/>
+            </wp:cNvGraphicFramePr>
+            <a:graphic xmlns:a="http://schemas.openxmlformats.org/drawingml/2006/main">
+              <a:graphicData uri="http://schemas.openxmlformats.org/drawingml/2006/picture">
+                <pic:pic xmlns:pic="http://schemas.openxmlformats.org/drawingml/2006/picture">
+                  <pic:nvPicPr>
+                    <pic:cNvPr id="1" name=""/>
+                    <pic:cNvPicPr/>
+                  </pic:nvPicPr>
+                  <pic:blipFill>
+                    <a:blip r:embed="rId26"/>
+                    <a:stretch>
+                      <a:fillRect/>
+                    </a:stretch>
+                  </pic:blipFill>
+                  <pic:spPr>
+                    <a:xfrm>
+                      <a:off x="0" y="0"/>
                       <a:ext cx="5731510" cy="5081905"/>
                     </a:xfrm>
                     <a:prstGeom prst="rect">
@@ -992,7 +1598,120 @@
       </w:pPr>
       <w:r>
         <w:rPr>
-          <w:lang w:val="en-US"/>
+          <w:noProof/>
+          <w:lang w:eastAsia="en-IN"/>
+        </w:rPr>
+        <w:lastRenderedPageBreak/>
+        <w:drawing>
+          <wp:inline distT="0" distB="0" distL="0" distR="0" wp14:anchorId="2C3E30C5" wp14:editId="2992EA91">
+            <wp:extent cx="5731510" cy="5081905"/>
+            <wp:effectExtent l="0" t="0" r="2540" b="4445"/>
+            <wp:docPr id="14" name="Picture 14"/>
+            <wp:cNvGraphicFramePr>
+              <a:graphicFrameLocks xmlns:a="http://schemas.openxmlformats.org/drawingml/2006/main" noChangeAspect="1"/>
+            </wp:cNvGraphicFramePr>
+            <a:graphic xmlns:a="http://schemas.openxmlformats.org/drawingml/2006/main">
+              <a:graphicData uri="http://schemas.openxmlformats.org/drawingml/2006/picture">
+                <pic:pic xmlns:pic="http://schemas.openxmlformats.org/drawingml/2006/picture">
+                  <pic:nvPicPr>
+                    <pic:cNvPr id="1" name=""/>
+                    <pic:cNvPicPr/>
+                  </pic:nvPicPr>
+                  <pic:blipFill>
+                    <a:blip r:embed="rId27"/>
+                    <a:stretch>
+                      <a:fillRect/>
+                    </a:stretch>
+                  </pic:blipFill>
+                  <pic:spPr>
+                    <a:xfrm>
+                      <a:off x="0" y="0"/>
+                      <a:ext cx="5731510" cy="5081905"/>
+                    </a:xfrm>
+                    <a:prstGeom prst="rect">
+                      <a:avLst/>
+                    </a:prstGeom>
+                  </pic:spPr>
+                </pic:pic>
+              </a:graphicData>
+            </a:graphic>
+          </wp:inline>
+        </w:drawing>
+      </w:r>
+    </w:p>
+    <w:p>
+      <w:pPr>
+        <w:rPr>
+          <w:lang w:val="en-US"/>
+        </w:rPr>
+      </w:pPr>
+    </w:p>
+    <w:p>
+      <w:pPr>
+        <w:rPr>
+          <w:lang w:val="en-US"/>
+        </w:rPr>
+      </w:pPr>
+      <w:r>
+        <w:rPr>
+          <w:noProof/>
+          <w:lang w:eastAsia="en-IN"/>
+        </w:rPr>
+        <w:lastRenderedPageBreak/>
+        <w:drawing>
+          <wp:inline distT="0" distB="0" distL="0" distR="0" wp14:anchorId="296FD76D" wp14:editId="415E2127">
+            <wp:extent cx="5731510" cy="5081905"/>
+            <wp:effectExtent l="0" t="0" r="2540" b="4445"/>
+            <wp:docPr id="15" name="Picture 15"/>
+            <wp:cNvGraphicFramePr>
+              <a:graphicFrameLocks xmlns:a="http://schemas.openxmlformats.org/drawingml/2006/main" noChangeAspect="1"/>
+            </wp:cNvGraphicFramePr>
+            <a:graphic xmlns:a="http://schemas.openxmlformats.org/drawingml/2006/main">
+              <a:graphicData uri="http://schemas.openxmlformats.org/drawingml/2006/picture">
+                <pic:pic xmlns:pic="http://schemas.openxmlformats.org/drawingml/2006/picture">
+                  <pic:nvPicPr>
+                    <pic:cNvPr id="1" name=""/>
+                    <pic:cNvPicPr/>
+                  </pic:nvPicPr>
+                  <pic:blipFill>
+                    <a:blip r:embed="rId28"/>
+                    <a:stretch>
+                      <a:fillRect/>
+                    </a:stretch>
+                  </pic:blipFill>
+                  <pic:spPr>
+                    <a:xfrm>
+                      <a:off x="0" y="0"/>
+                      <a:ext cx="5731510" cy="5081905"/>
+                    </a:xfrm>
+                    <a:prstGeom prst="rect">
+                      <a:avLst/>
+                    </a:prstGeom>
+                  </pic:spPr>
+                </pic:pic>
+              </a:graphicData>
+            </a:graphic>
+          </wp:inline>
+        </w:drawing>
+      </w:r>
+    </w:p>
+    <w:p>
+      <w:pPr>
+        <w:rPr>
+          <w:lang w:val="en-US"/>
+        </w:rPr>
+      </w:pPr>
+    </w:p>
+    <w:p>
+      <w:pPr>
+        <w:rPr>
+          <w:lang w:val="en-US"/>
+        </w:rPr>
+      </w:pPr>
+      <w:r>
+        <w:rPr>
+          <w:noProof/>
+          <w:lang w:eastAsia="en-IN"/>
         </w:rPr>
         <w:lastRenderedPageBreak/>
         <w:drawing>
@@ -1011,7 +1730,7 @@
                     <pic:cNvPicPr/>
                   </pic:nvPicPr>
                   <pic:blipFill>
-                    <a:blip r:embed="rId20"/>
+                    <a:blip r:embed="rId29"/>
                     <a:stretch>
                       <a:fillRect/>
                     </a:stretch>

</xml_diff>